<commit_message>
Update thesis submission date
</commit_message>
<xml_diff>
--- a/Thesis.docx
+++ b/Thesis.docx
@@ -176,13 +176,7 @@
         <w:t xml:space="preserve">Submitted on </w:t>
       </w:r>
       <w:r>
-        <w:t>July 15</w:t>
-      </w:r>
-      <w:r>
-        <w:rPr>
-          <w:vertAlign w:val="superscript"/>
-        </w:rPr>
-        <w:t>th</w:t>
+        <w:t>September 1st</w:t>
       </w:r>
       <w:r>
         <w:t>, 2026</w:t>

</xml_diff>